<commit_message>
docs: adecuar Estudio Inicial y Plan de Proyecto ante observaciones de catedra
- Estudio Inicial (v1.6.0): fundamentar validez del procedimiento 2026 por el TD (Circular 001/2026), documentar tecnicas y fuentes de relevamiento e inmersion institucional, reformular seccion 3.7 al flujo AS-IS (manual sin SGD-AVEIT) con matriz comparativa, depurar ambito fisico y separar oportunidades de negocio.
- Plan de Proyecto (v2.0.0): incorporar caratula formal, equipo y habilidades full-stack polivalentes con rotacion, taxonomía de SI (systemClassifier), desglose granular de RF-01 a RF-15 con prioridad MoSCoW, matriz de trazabilidad normativa, catalogo de reglas RN-01 a RN-10 (reemplazo de computo algoritmico), RNF (ISO 25010 / Planguage), firma electronica interna colegiada (no Ley 25.506), requisito de integridad y trazabilidad transaccional del saldo (reformulando no UPDATE), detalle operativo de Scrumban y realizacion de CU-01 (useCaseExtractor).
</commit_message>
<xml_diff>
--- a/docs formales/Plan_de_Proyecto.docx
+++ b/docs formales/Plan_de_Proyecto.docx
@@ -11,9 +11,9 @@
       </w:pPr>
       <w:r>
         <w:rPr>
-          <w:lang w:val="es-MX"/>
+          <w:b/>
         </w:rPr>
-        <w:t>Acá debería ir la carátula</w:t>
+        <w:t>UNIVERSIDAD TECNOLÓGICA NACIONAL — FACULTAD REGIONAL CÓRDOBA</w:t>
       </w:r>
     </w:p>
     <w:p>
@@ -24,22 +24,7 @@
         </w:rPr>
       </w:pPr>
       <w:r>
-        <w:rPr>
-          <w:lang w:val="es-MX"/>
-        </w:rPr>
-        <w:t>Fondo-Imagen-Integrantes</w:t>
-      </w:r>
-      <w:r>
-        <w:rPr>
-          <w:lang w:val="es-MX"/>
-        </w:rPr>
-        <w:t xml:space="preserve"> </w:t>
-      </w:r>
-      <w:r>
-        <w:rPr>
-          <w:lang w:val="es-MX"/>
-        </w:rPr>
-        <w:br w:type="page"/>
+        <w:t>Seminario Integrador 2026 — Curso 3K2 — Grupo 04 — SGD-AVEIT</w:t>
       </w:r>
     </w:p>
     <w:tbl>
@@ -3847,6 +3832,90 @@
                 <w:lang w:val="es-MX"/>
               </w:rPr>
               <w:t>Estructuración de formato y presentación según Guía Documentación UTN FRC.</w:t>
+            </w:r>
+          </w:p>
+        </w:tc>
+      </w:tr>
+      <w:tr>
+        <w:tc>
+          <w:tcPr>
+            <w:tcW w:type="dxa" w:w="2454"/>
+          </w:tcPr>
+          <w:p>
+            <w:r>
+              <w:t>2.0.0</w:t>
+            </w:r>
+          </w:p>
+        </w:tc>
+        <w:tc>
+          <w:tcPr>
+            <w:tcW w:type="dxa" w:w="2460"/>
+          </w:tcPr>
+          <w:p>
+            <w:r>
+              <w:t>03/09/2026</w:t>
+            </w:r>
+          </w:p>
+        </w:tc>
+        <w:tc>
+          <w:tcPr>
+            <w:tcW w:type="dxa" w:w="2462"/>
+          </w:tcPr>
+          <w:p>
+            <w:r>
+              <w:t>Equipo de Proyecto SGD-AVEIT</w:t>
+            </w:r>
+          </w:p>
+        </w:tc>
+        <w:tc>
+          <w:tcPr>
+            <w:tcW w:type="dxa" w:w="2466"/>
+          </w:tcPr>
+          <w:p>
+            <w:r>
+              <w:t>Adecuación integral ante observaciones de cátedra: incorporación de carátula formal, matriz de habilidades full-stack polivalentes con rotación, taxonomía de SI (systemClassifier), desglose granular de RF-01 a RF-15, matriz de trazabilidad normativa, catálogo de reglas de negocio RN-01 a RN-10 (erradicando 'cómputo algorítmico'), separación estricta de RNF (ISO 25010) de restricciones tecnológicas RES, definición de firma electrónica interna colegiada (no Ley 25.506), requisito de integridad y trazabilidad transaccional del saldo (reformulando 'no UPDATE directos'), detalle operativo de Scrumban (cadencias, límites WIP, code review), y especificación formal de casos de uso Cockburn en 2 columnas con BDD Gherkin (useCaseExtractor).</w:t>
+            </w:r>
+          </w:p>
+        </w:tc>
+      </w:tr>
+      <w:tr>
+        <w:tc>
+          <w:tcPr>
+            <w:tcW w:type="dxa" w:w="2454"/>
+          </w:tcPr>
+          <w:p>
+            <w:r>
+              <w:t>2.0.0</w:t>
+            </w:r>
+          </w:p>
+        </w:tc>
+        <w:tc>
+          <w:tcPr>
+            <w:tcW w:type="dxa" w:w="2460"/>
+          </w:tcPr>
+          <w:p>
+            <w:r>
+              <w:t>03/09/2026</w:t>
+            </w:r>
+          </w:p>
+        </w:tc>
+        <w:tc>
+          <w:tcPr>
+            <w:tcW w:type="dxa" w:w="2462"/>
+          </w:tcPr>
+          <w:p>
+            <w:r>
+              <w:t>Equipo de Proyecto SGD-AVEIT</w:t>
+            </w:r>
+          </w:p>
+        </w:tc>
+        <w:tc>
+          <w:tcPr>
+            <w:tcW w:type="dxa" w:w="2466"/>
+          </w:tcPr>
+          <w:p>
+            <w:r>
+              <w:t>Adecuación integral ante observaciones de cátedra: incorporación de carátula formal, matriz de habilidades full-stack polivalentes con rotación, taxonomía de SI (systemClassifier), desglose granular de RF-01 a RF-15, matriz de trazabilidad normativa, catálogo de reglas de negocio RN-01 a RN-10 (erradicando 'cómputo algorítmico'), separación estricta de RNF (ISO 25010) de restricciones tecnológicas RES, definición de firma electrónica interna colegiada (no Ley 25.506), requisito de integridad y trazabilidad transaccional del saldo (reformulando 'no UPDATE directos'), detalle operativo de Scrumban (cadencias, límites WIP, code review), y especificación formal de casos de uso Cockburn en 2 columnas con BDD Gherkin (useCaseExtractor).</w:t>
             </w:r>
           </w:p>
         </w:tc>
@@ -4025,10 +4094,7 @@
         </w:rPr>
       </w:pPr>
       <w:r>
-        <w:rPr>
-          <w:lang w:val="es-MX"/>
-        </w:rPr>
-        <w:t>El objetivo principal de SGD-AVEIT es centralizar, sistematizar, auditar y transparentar la gestión integral de expedientes disciplinarios de la asociación. Mediante la automatización del flujo procesal (recepción de formularios T01, T02, T03, cómputo algorítmico de puntajes de premios y sanciones, y generación de balances cuatrimestrales), el sistema reducirá drásticamente la carga operativa manual del Tribunal de Disciplina y mitigará errores e irregularidades.</w:t>
+        <w:t>El objetivo principal de SGD-AVEIT es centralizar, sistematizar, auditar y transparentar la gestión integral de expedientes disciplinarios de la asociación. Mediante la automatización del flujo procesal (recepción de formularios T01, T02, T03, cálculo transaccional inmutable según reglas de negocio formalizadas de puntajes de premios y sanciones, y generación de balances cuatrimestrales), el sistema reducirá drásticamente la carga operativa manual del Tribunal de Disciplina y mitigará errores e irregularidades.</w:t>
       </w:r>
     </w:p>
     <w:p>
@@ -4216,10 +4282,7 @@
         </w:rPr>
       </w:pPr>
       <w:r>
-        <w:rPr>
-          <w:lang w:val="es-MX"/>
-        </w:rPr>
-        <w:t>Registrar Resoluciones y Votaciones: Habilita la firma colegiada digital y la carga de dictámenes finales del Tribunal de Disciplina.</w:t>
+        <w:t>Registrar Resoluciones y Votaciones: Habilita la aprobación colegiada autenticada mediante firma electrónica interna y la carga de dictámenes finales del Tribunal de Disciplina.</w:t>
       </w:r>
     </w:p>
     <w:p>
@@ -4962,7 +5025,9 @@
         <w:spacing w:before="20" w:after="40"/>
       </w:pPr>
       <w:r>
-        <w:t>Sanchez, Diego Gabriel</w:t>
+        <w:t>• Sanchez, Diego Gabriel — Product Owner / Líder de Proyecto / Full-Stack Developer</w:t>
+        <w:br/>
+        <w:t>SKILLS: Dominio del marco normativo e institucional de AVEIT (Ex-Secretario General de CD y actual Autoridad de Subcomisión GSA); arquitectura de software, backend Python, diseño relacional MySQL, articulación con Tribunal de Disciplina y Cómputos.</w:t>
       </w:r>
     </w:p>
     <w:p>
@@ -4971,9 +5036,7 @@
         <w:spacing w:before="20" w:after="40"/>
         <w:ind w:left="720"/>
       </w:pPr>
-      <w:r>
-        <w:t>SKILLS:</w:t>
-      </w:r>
+      <w:r/>
     </w:p>
     <w:p>
       <w:pPr>
@@ -4981,7 +5044,9 @@
         <w:spacing w:before="20" w:after="40"/>
       </w:pPr>
       <w:r>
-        <w:t>Guillén, Lucas Martín</w:t>
+        <w:t>• Guillén, Lucas Martín — Scrum Master / Full-Stack Developer</w:t>
+        <w:br/>
+        <w:t>SKILLS: Gestión ágil en Jira Software, facilitación de ceremonias Scrumban, remoción de impedimentos, métricas de ciclo (Lead Time, Cycle Time), backend Python y APIs RESTful.</w:t>
       </w:r>
     </w:p>
     <w:p>
@@ -4990,9 +5055,7 @@
         <w:spacing w:before="20" w:after="40"/>
         <w:ind w:left="720"/>
       </w:pPr>
-      <w:r>
-        <w:t>SKILLS: .</w:t>
-      </w:r>
+      <w:r/>
     </w:p>
     <w:p>
       <w:pPr>
@@ -5000,7 +5063,9 @@
         <w:spacing w:before="20" w:after="40"/>
       </w:pPr>
       <w:r>
-        <w:t>Rosales, Nicolás</w:t>
+        <w:t>• Rosales, Nicolás — Full-Stack Developer</w:t>
+        <w:br/>
+        <w:t>SKILLS: Especialidad en Frontend Web Responsive, maquetación HTML5/CSS3 moderno y Tailwind CSS, diseño mobile-first adaptativo, JavaScript y consumo de APIs asíncronas.</w:t>
       </w:r>
     </w:p>
     <w:p>
@@ -5009,9 +5074,7 @@
         <w:spacing w:before="20" w:after="40"/>
         <w:ind w:left="720"/>
       </w:pPr>
-      <w:r>
-        <w:t>SKILLS: .</w:t>
-      </w:r>
+      <w:r/>
     </w:p>
     <w:p>
       <w:pPr>
@@ -5019,7 +5082,9 @@
         <w:spacing w:before="20" w:after="40"/>
       </w:pPr>
       <w:r>
-        <w:t>Gastiaburu, Lucas</w:t>
+        <w:t>• Gastiaburu, Lucas — Full-Stack Developer</w:t>
+        <w:br/>
+        <w:t>SKILLS: Especialidad en lógica de negocio backend en Python, control de sesiones y autenticación RBAC, validación de reglas de negocio y transacciones de base de datos.</w:t>
       </w:r>
     </w:p>
     <w:p>
@@ -5028,9 +5093,7 @@
         <w:spacing w:before="20" w:after="40"/>
         <w:ind w:left="720"/>
       </w:pPr>
-      <w:r>
-        <w:t>SKILLS: .</w:t>
-      </w:r>
+      <w:r/>
     </w:p>
     <w:p>
       <w:pPr>
@@ -5038,7 +5101,9 @@
         <w:spacing w:before="20" w:after="40"/>
       </w:pPr>
       <w:r>
-        <w:t>Villegas, Axel Rene</w:t>
+        <w:t>• Villegas, Axel Rene — Full-Stack Developer</w:t>
+        <w:br/>
+        <w:t>SKILLS: Especialidad en Administración de Bases de Datos MySQL, diseño entidad-relación, implementación de triggers de auditoría transaccional, inmutabilidad y scripts de migración.</w:t>
       </w:r>
     </w:p>
     <w:p>
@@ -5047,9 +5112,7 @@
         <w:spacing w:before="20" w:after="40"/>
         <w:ind w:left="720"/>
       </w:pPr>
-      <w:r>
-        <w:t>SKILLS: .</w:t>
-      </w:r>
+      <w:r/>
     </w:p>
     <w:p>
       <w:pPr>
@@ -5057,7 +5120,9 @@
         <w:spacing w:before="20" w:after="40"/>
       </w:pPr>
       <w:r>
-        <w:t>Urviola, Luis</w:t>
+        <w:t>• Urviola, Luis — Full-Stack Developer</w:t>
+        <w:br/>
+        <w:t>SKILLS: Especialidad en Aseguramiento de Calidad (QA) y Testing, diseño y ejecución de casos de prueba funcionales, verificación de criterios de aceptación BDD Gherkin y usabilidad.</w:t>
       </w:r>
     </w:p>
     <w:p>
@@ -5069,12 +5134,7 @@
           <w:lang w:val="es-MX"/>
         </w:rPr>
       </w:pPr>
-      <w:r>
-        <w:rPr>
-          <w:lang w:val="es-MX"/>
-        </w:rPr>
-        <w:t>SKILLS: Python, Aseguramiento de Calidad en Documentación, Diseño</w:t>
-      </w:r>
+      <w:r/>
     </w:p>
     <w:p>
       <w:pPr>
@@ -5082,7 +5142,9 @@
         <w:spacing w:before="20" w:after="40"/>
       </w:pPr>
       <w:r>
-        <w:t>Quiroz, Tomas Augusto</w:t>
+        <w:t>• Quiroz, Tomas Augusto — Full-Stack Developer</w:t>
+        <w:br/>
+        <w:t>SKILLS: Especialidad en Infraestructura de Staging independiente, configuración de entornos de ejecución, pipelines de CI en GitHub, control de versiones Git y documentación técnica.</w:t>
       </w:r>
     </w:p>
     <w:p>
@@ -5091,8 +5153,1712 @@
         <w:spacing w:before="20" w:after="40"/>
         <w:ind w:left="720"/>
       </w:pPr>
+      <w:r/>
+    </w:p>
+    <w:p>
       <w:r>
-        <w:t>SKILLS:</w:t>
+        <w:br w:type="page"/>
+      </w:r>
+    </w:p>
+    <w:p>
+      <w:pPr>
+        <w:pStyle w:val="Ttulo2"/>
+      </w:pPr>
+      <w:r>
+        <w:t>CLASIFICACIÓN SISTÉMICA Y TAXONOMÍA DE SI (systemClassifier)</w:t>
+      </w:r>
+    </w:p>
+    <w:p>
+      <w:r>
+        <w:t>El sistema SGD-AVEIT se estructura bajo el paradigma de la Teoría General de Sistemas (TGS) como un sistema abierto inserto en el suprasistema A.V.E.I.T. Sus componentes funcionales se clasifican de acuerdo a la pirámide organizacional en:</w:t>
+        <w:br/>
+        <w:t>• TPS (Transaction Processing System): Módulo de Expedientes y Formularios (T01, T02, T03) y Motor de Ledger de Puntos, que procesan transacciones operativas en tiempo real con reglas fijas.</w:t>
+        <w:br/>
+        <w:t>• MIS (Management Information System): Módulo de Balances Cuatrimestrales y Estadísticas (Art. 137 del Reglamento Interno), que agrega datos transaccionales para supervisión táctica de subcomisiones.</w:t>
+        <w:br/>
+        <w:t>• DSS (Decision Support System): Tablero de Estados de Causas y Sistema de Alertas Escalonadas (-7 pts y -10 pts), que asiste al Tribunal de Disciplina y a CD mediante indicadores tempranos y precedentes jurisprudenciales.</w:t>
+        <w:br/>
+        <w:t>• EIS / Portal Ejecutivo: Portal de Transparencia Pública para consulta general del padrón y rendición de cuentas ante Asambleas.</w:t>
+      </w:r>
+    </w:p>
+    <w:p>
+      <w:pPr>
+        <w:pStyle w:val="Ttulo2"/>
+      </w:pPr>
+      <w:r>
+        <w:t>DESGLOSE GRANULAR DE REQUERIMIENTOS FUNCIONALES (requirementsExtractor)</w:t>
+      </w:r>
+    </w:p>
+    <w:p>
+      <w:r>
+        <w:t>A continuación se especifican los 15 Requerimientos Funcionales prioritarios (MoSCoW):</w:t>
+      </w:r>
+    </w:p>
+    <w:tbl>
+      <w:tblPr>
+        <w:tblW w:type="auto" w:w="0"/>
+        <w:jc w:val="center"/>
+        <w:tblLook w:firstColumn="1" w:firstRow="1" w:lastColumn="0" w:lastRow="0" w:noHBand="0" w:noVBand="1" w:val="04A0"/>
+      </w:tblPr>
+      <w:tblGrid>
+        <w:gridCol w:w="2400"/>
+        <w:gridCol w:w="2400"/>
+        <w:gridCol w:w="2400"/>
+        <w:gridCol w:w="2400"/>
+      </w:tblGrid>
+      <w:tr>
+        <w:tc>
+          <w:tcPr>
+            <w:tcW w:type="dxa" w:w="2400"/>
+          </w:tcPr>
+          <w:p>
+            <w:r>
+              <w:rPr>
+                <w:b/>
+              </w:rPr>
+              <w:t>ID</w:t>
+            </w:r>
+          </w:p>
+        </w:tc>
+        <w:tc>
+          <w:tcPr>
+            <w:tcW w:type="dxa" w:w="2400"/>
+          </w:tcPr>
+          <w:p>
+            <w:r>
+              <w:rPr>
+                <w:b/>
+              </w:rPr>
+              <w:t>Nombre Requerimiento</w:t>
+            </w:r>
+          </w:p>
+        </w:tc>
+        <w:tc>
+          <w:tcPr>
+            <w:tcW w:type="dxa" w:w="2400"/>
+          </w:tcPr>
+          <w:p>
+            <w:r>
+              <w:rPr>
+                <w:b/>
+              </w:rPr>
+              <w:t>Descripción Técnica / Funcional</w:t>
+            </w:r>
+          </w:p>
+        </w:tc>
+        <w:tc>
+          <w:tcPr>
+            <w:tcW w:type="dxa" w:w="2400"/>
+          </w:tcPr>
+          <w:p>
+            <w:r>
+              <w:rPr>
+                <w:b/>
+              </w:rPr>
+              <w:t>MoSCoW</w:t>
+            </w:r>
+          </w:p>
+        </w:tc>
+      </w:tr>
+      <w:tr>
+        <w:tc>
+          <w:tcPr>
+            <w:tcW w:type="dxa" w:w="2400"/>
+          </w:tcPr>
+          <w:p>
+            <w:r>
+              <w:t>RF-01</w:t>
+            </w:r>
+          </w:p>
+        </w:tc>
+        <w:tc>
+          <w:tcPr>
+            <w:tcW w:type="dxa" w:w="2400"/>
+          </w:tcPr>
+          <w:p>
+            <w:r>
+              <w:t>Gestión de Solicitudes T01</w:t>
+            </w:r>
+          </w:p>
+        </w:tc>
+        <w:tc>
+          <w:tcPr>
+            <w:tcW w:type="dxa" w:w="2400"/>
+          </w:tcPr>
+          <w:p>
+            <w:r>
+              <w:t>Alta formal de solicitudes de sanción/premio con Hoja de Anexo por autoridades habilitadas.</w:t>
+            </w:r>
+          </w:p>
+        </w:tc>
+        <w:tc>
+          <w:tcPr>
+            <w:tcW w:type="dxa" w:w="2400"/>
+          </w:tcPr>
+          <w:p>
+            <w:r>
+              <w:t>Must Have</w:t>
+            </w:r>
+          </w:p>
+        </w:tc>
+      </w:tr>
+      <w:tr>
+        <w:tc>
+          <w:tcPr>
+            <w:tcW w:type="dxa" w:w="2400"/>
+          </w:tcPr>
+          <w:p>
+            <w:r>
+              <w:t>RF-02</w:t>
+            </w:r>
+          </w:p>
+        </w:tc>
+        <w:tc>
+          <w:tcPr>
+            <w:tcW w:type="dxa" w:w="2400"/>
+          </w:tcPr>
+          <w:p>
+            <w:r>
+              <w:t>Apertura y Registro de Expediente</w:t>
+            </w:r>
+          </w:p>
+        </w:tc>
+        <w:tc>
+          <w:tcPr>
+            <w:tcW w:type="dxa" w:w="2400"/>
+          </w:tcPr>
+          <w:p>
+            <w:r>
+              <w:t>Generación unívoca de número de expediente y sellado de tiempo inicial.</w:t>
+            </w:r>
+          </w:p>
+        </w:tc>
+        <w:tc>
+          <w:tcPr>
+            <w:tcW w:type="dxa" w:w="2400"/>
+          </w:tcPr>
+          <w:p>
+            <w:r>
+              <w:t>Must Have</w:t>
+            </w:r>
+          </w:p>
+        </w:tc>
+      </w:tr>
+      <w:tr>
+        <w:tc>
+          <w:tcPr>
+            <w:tcW w:type="dxa" w:w="2400"/>
+          </w:tcPr>
+          <w:p>
+            <w:r>
+              <w:t>RF-03</w:t>
+            </w:r>
+          </w:p>
+        </w:tc>
+        <w:tc>
+          <w:tcPr>
+            <w:tcW w:type="dxa" w:w="2400"/>
+          </w:tcPr>
+          <w:p>
+            <w:r>
+              <w:t>Despacho de Acuses de Sanción</w:t>
+            </w:r>
+          </w:p>
+        </w:tc>
+        <w:tc>
+          <w:tcPr>
+            <w:tcW w:type="dxa" w:w="2400"/>
+          </w:tcPr>
+          <w:p>
+            <w:r>
+              <w:t>Notificación electrónica fehaciente al imputado iniciando el cómputo de términos.</w:t>
+            </w:r>
+          </w:p>
+        </w:tc>
+        <w:tc>
+          <w:tcPr>
+            <w:tcW w:type="dxa" w:w="2400"/>
+          </w:tcPr>
+          <w:p>
+            <w:r>
+              <w:t>Must Have</w:t>
+            </w:r>
+          </w:p>
+        </w:tc>
+      </w:tr>
+      <w:tr>
+        <w:tc>
+          <w:tcPr>
+            <w:tcW w:type="dxa" w:w="2400"/>
+          </w:tcPr>
+          <w:p>
+            <w:r>
+              <w:t>RF-04</w:t>
+            </w:r>
+          </w:p>
+        </w:tc>
+        <w:tc>
+          <w:tcPr>
+            <w:tcW w:type="dxa" w:w="2400"/>
+          </w:tcPr>
+          <w:p>
+            <w:r>
+              <w:t>Control de Plazo Preclusivo (5 días)</w:t>
+            </w:r>
+          </w:p>
+        </w:tc>
+        <w:tc>
+          <w:tcPr>
+            <w:tcW w:type="dxa" w:w="2400"/>
+          </w:tcPr>
+          <w:p>
+            <w:r>
+              <w:t>Temporizador automatizado de 5 días hábiles; bloqueo irreversible al vencimiento.</w:t>
+            </w:r>
+          </w:p>
+        </w:tc>
+        <w:tc>
+          <w:tcPr>
+            <w:tcW w:type="dxa" w:w="2400"/>
+          </w:tcPr>
+          <w:p>
+            <w:r>
+              <w:t>Must Have</w:t>
+            </w:r>
+          </w:p>
+        </w:tc>
+      </w:tr>
+      <w:tr>
+        <w:tc>
+          <w:tcPr>
+            <w:tcW w:type="dxa" w:w="2400"/>
+          </w:tcPr>
+          <w:p>
+            <w:r>
+              <w:t>RF-05</w:t>
+            </w:r>
+          </w:p>
+        </w:tc>
+        <w:tc>
+          <w:tcPr>
+            <w:tcW w:type="dxa" w:w="2400"/>
+          </w:tcPr>
+          <w:p>
+            <w:r>
+              <w:t>Carga Digital de Formulario T02</w:t>
+            </w:r>
+          </w:p>
+        </w:tc>
+        <w:tc>
+          <w:tcPr>
+            <w:tcW w:type="dxa" w:w="2400"/>
+          </w:tcPr>
+          <w:p>
+            <w:r>
+              <w:t>Interfaz responsive para presentar justificaciones tipificadas con adjuntos probatorios.</w:t>
+            </w:r>
+          </w:p>
+        </w:tc>
+        <w:tc>
+          <w:tcPr>
+            <w:tcW w:type="dxa" w:w="2400"/>
+          </w:tcPr>
+          <w:p>
+            <w:r>
+              <w:t>Must Have</w:t>
+            </w:r>
+          </w:p>
+        </w:tc>
+      </w:tr>
+      <w:tr>
+        <w:tc>
+          <w:tcPr>
+            <w:tcW w:type="dxa" w:w="2400"/>
+          </w:tcPr>
+          <w:p>
+            <w:r>
+              <w:t>RF-06</w:t>
+            </w:r>
+          </w:p>
+        </w:tc>
+        <w:tc>
+          <w:tcPr>
+            <w:tcW w:type="dxa" w:w="2400"/>
+          </w:tcPr>
+          <w:p>
+            <w:r>
+              <w:t>Carga Digital de Formulario T03</w:t>
+            </w:r>
+          </w:p>
+        </w:tc>
+        <w:tc>
+          <w:tcPr>
+            <w:tcW w:type="dxa" w:w="2400"/>
+          </w:tcPr>
+          <w:p>
+            <w:r>
+              <w:t>Interfaz responsive para descargos extraordinarios evaluados por sana crítica.</w:t>
+            </w:r>
+          </w:p>
+        </w:tc>
+        <w:tc>
+          <w:tcPr>
+            <w:tcW w:type="dxa" w:w="2400"/>
+          </w:tcPr>
+          <w:p>
+            <w:r>
+              <w:t>Must Have</w:t>
+            </w:r>
+          </w:p>
+        </w:tc>
+      </w:tr>
+      <w:tr>
+        <w:tc>
+          <w:tcPr>
+            <w:tcW w:type="dxa" w:w="2400"/>
+          </w:tcPr>
+          <w:p>
+            <w:r>
+              <w:t>RF-07</w:t>
+            </w:r>
+          </w:p>
+        </w:tc>
+        <w:tc>
+          <w:tcPr>
+            <w:tcW w:type="dxa" w:w="2400"/>
+          </w:tcPr>
+          <w:p>
+            <w:r>
+              <w:t>Tablero de Control de los 6 Estados</w:t>
+            </w:r>
+          </w:p>
+        </w:tc>
+        <w:tc>
+          <w:tcPr>
+            <w:tcW w:type="dxa" w:w="2400"/>
+          </w:tcPr>
+          <w:p>
+            <w:r>
+              <w:t>Visualización y transición estricta de expedientes a lo largo de sus 6 estados oficiales.</w:t>
+            </w:r>
+          </w:p>
+        </w:tc>
+        <w:tc>
+          <w:tcPr>
+            <w:tcW w:type="dxa" w:w="2400"/>
+          </w:tcPr>
+          <w:p>
+            <w:r>
+              <w:t>Must Have</w:t>
+            </w:r>
+          </w:p>
+        </w:tc>
+      </w:tr>
+      <w:tr>
+        <w:tc>
+          <w:tcPr>
+            <w:tcW w:type="dxa" w:w="2400"/>
+          </w:tcPr>
+          <w:p>
+            <w:r>
+              <w:t>RF-08</w:t>
+            </w:r>
+          </w:p>
+        </w:tc>
+        <w:tc>
+          <w:tcPr>
+            <w:tcW w:type="dxa" w:w="2400"/>
+          </w:tcPr>
+          <w:p>
+            <w:r>
+              <w:t>Evaluación y Sustanciación de Descargos</w:t>
+            </w:r>
+          </w:p>
+        </w:tc>
+        <w:tc>
+          <w:tcPr>
+            <w:tcW w:type="dxa" w:w="2400"/>
+          </w:tcPr>
+          <w:p>
+            <w:r>
+              <w:t>Herramientas de revisión probatoria, aprobación o rechazo fundado de justificaciones.</w:t>
+            </w:r>
+          </w:p>
+        </w:tc>
+        <w:tc>
+          <w:tcPr>
+            <w:tcW w:type="dxa" w:w="2400"/>
+          </w:tcPr>
+          <w:p>
+            <w:r>
+              <w:t>Must Have</w:t>
+            </w:r>
+          </w:p>
+        </w:tc>
+      </w:tr>
+      <w:tr>
+        <w:tc>
+          <w:tcPr>
+            <w:tcW w:type="dxa" w:w="2400"/>
+          </w:tcPr>
+          <w:p>
+            <w:r>
+              <w:t>RF-09</w:t>
+            </w:r>
+          </w:p>
+        </w:tc>
+        <w:tc>
+          <w:tcPr>
+            <w:tcW w:type="dxa" w:w="2400"/>
+          </w:tcPr>
+          <w:p>
+            <w:r>
+              <w:t>Registro Nominal de Votación del TD</w:t>
+            </w:r>
+          </w:p>
+        </w:tc>
+        <w:tc>
+          <w:tcPr>
+            <w:tcW w:type="dxa" w:w="2400"/>
+          </w:tcPr>
+          <w:p>
+            <w:r>
+              <w:t>Cómputo formal de mayoría absoluta en votación nominal individual de miembros habilitados.</w:t>
+            </w:r>
+          </w:p>
+        </w:tc>
+        <w:tc>
+          <w:tcPr>
+            <w:tcW w:type="dxa" w:w="2400"/>
+          </w:tcPr>
+          <w:p>
+            <w:r>
+              <w:t>Must Have</w:t>
+            </w:r>
+          </w:p>
+        </w:tc>
+      </w:tr>
+      <w:tr>
+        <w:tc>
+          <w:tcPr>
+            <w:tcW w:type="dxa" w:w="2400"/>
+          </w:tcPr>
+          <w:p>
+            <w:r>
+              <w:t>RF-10</w:t>
+            </w:r>
+          </w:p>
+        </w:tc>
+        <w:tc>
+          <w:tcPr>
+            <w:tcW w:type="dxa" w:w="2400"/>
+          </w:tcPr>
+          <w:p>
+            <w:r>
+              <w:t>Redacción Guiada de Resoluciones</w:t>
+            </w:r>
+          </w:p>
+        </w:tc>
+        <w:tc>
+          <w:tcPr>
+            <w:tcW w:type="dxa" w:w="2400"/>
+          </w:tcPr>
+          <w:p>
+            <w:r>
+              <w:t>Plantilla jurídica obligatoria (Vistos, Considerandos y Resolución) con graduación de puntos.</w:t>
+            </w:r>
+          </w:p>
+        </w:tc>
+        <w:tc>
+          <w:tcPr>
+            <w:tcW w:type="dxa" w:w="2400"/>
+          </w:tcPr>
+          <w:p>
+            <w:r>
+              <w:t>Must Have</w:t>
+            </w:r>
+          </w:p>
+        </w:tc>
+      </w:tr>
+      <w:tr>
+        <w:tc>
+          <w:tcPr>
+            <w:tcW w:type="dxa" w:w="2400"/>
+          </w:tcPr>
+          <w:p>
+            <w:r>
+              <w:t>RF-11</w:t>
+            </w:r>
+          </w:p>
+        </w:tc>
+        <w:tc>
+          <w:tcPr>
+            <w:tcW w:type="dxa" w:w="2400"/>
+          </w:tcPr>
+          <w:p>
+            <w:r>
+              <w:t>Aprobación Colegiada Autenticada</w:t>
+            </w:r>
+          </w:p>
+        </w:tc>
+        <w:tc>
+          <w:tcPr>
+            <w:tcW w:type="dxa" w:w="2400"/>
+          </w:tcPr>
+          <w:p>
+            <w:r>
+              <w:t>Firma electrónica interna de Socios Seniors con ID, timestamp y hash SHA-256.</w:t>
+            </w:r>
+          </w:p>
+        </w:tc>
+        <w:tc>
+          <w:tcPr>
+            <w:tcW w:type="dxa" w:w="2400"/>
+          </w:tcPr>
+          <w:p>
+            <w:r>
+              <w:t>Must Have</w:t>
+            </w:r>
+          </w:p>
+        </w:tc>
+      </w:tr>
+      <w:tr>
+        <w:tc>
+          <w:tcPr>
+            <w:tcW w:type="dxa" w:w="2400"/>
+          </w:tcPr>
+          <w:p>
+            <w:r>
+              <w:t>RF-12</w:t>
+            </w:r>
+          </w:p>
+        </w:tc>
+        <w:tc>
+          <w:tcPr>
+            <w:tcW w:type="dxa" w:w="2400"/>
+          </w:tcPr>
+          <w:p>
+            <w:r>
+              <w:t>Cómputo Inmutable de Saldos de Puntos</w:t>
+            </w:r>
+          </w:p>
+        </w:tc>
+        <w:tc>
+          <w:tcPr>
+            <w:tcW w:type="dxa" w:w="2400"/>
+          </w:tcPr>
+          <w:p>
+            <w:r>
+              <w:t>Impacto transaccional de puntos en múltiplos de 0.5 mediante triggers y lógica de backend.</w:t>
+            </w:r>
+          </w:p>
+        </w:tc>
+        <w:tc>
+          <w:tcPr>
+            <w:tcW w:type="dxa" w:w="2400"/>
+          </w:tcPr>
+          <w:p>
+            <w:r>
+              <w:t>Must Have</w:t>
+            </w:r>
+          </w:p>
+        </w:tc>
+      </w:tr>
+      <w:tr>
+        <w:tc>
+          <w:tcPr>
+            <w:tcW w:type="dxa" w:w="2400"/>
+          </w:tcPr>
+          <w:p>
+            <w:r>
+              <w:t>RF-13</w:t>
+            </w:r>
+          </w:p>
+        </w:tc>
+        <w:tc>
+          <w:tcPr>
+            <w:tcW w:type="dxa" w:w="2400"/>
+          </w:tcPr>
+          <w:p>
+            <w:r>
+              <w:t>Disparo de Alertas Escalonadas</w:t>
+            </w:r>
+          </w:p>
+        </w:tc>
+        <w:tc>
+          <w:tcPr>
+            <w:tcW w:type="dxa" w:w="2400"/>
+          </w:tcPr>
+          <w:p>
+            <w:r>
+              <w:t>Alerta amarilla a -7 pts y alerta roja de pérdida de condición de socio a -10 pts (Art. 93).</w:t>
+            </w:r>
+          </w:p>
+        </w:tc>
+        <w:tc>
+          <w:tcPr>
+            <w:tcW w:type="dxa" w:w="2400"/>
+          </w:tcPr>
+          <w:p>
+            <w:r>
+              <w:t>Must Have</w:t>
+            </w:r>
+          </w:p>
+        </w:tc>
+      </w:tr>
+      <w:tr>
+        <w:tc>
+          <w:tcPr>
+            <w:tcW w:type="dxa" w:w="2400"/>
+          </w:tcPr>
+          <w:p>
+            <w:r>
+              <w:t>RF-14</w:t>
+            </w:r>
+          </w:p>
+        </w:tc>
+        <w:tc>
+          <w:tcPr>
+            <w:tcW w:type="dxa" w:w="2400"/>
+          </w:tcPr>
+          <w:p>
+            <w:r>
+              <w:t>Generación de Balances Cuatrimestrales</w:t>
+            </w:r>
+          </w:p>
+        </w:tc>
+        <w:tc>
+          <w:tcPr>
+            <w:tcW w:type="dxa" w:w="2400"/>
+          </w:tcPr>
+          <w:p>
+            <w:r>
+              <w:t>Emisión instantánea en PDF del balance de auditoría por subcomisiones y categoría (Art. 137).</w:t>
+            </w:r>
+          </w:p>
+        </w:tc>
+        <w:tc>
+          <w:tcPr>
+            <w:tcW w:type="dxa" w:w="2400"/>
+          </w:tcPr>
+          <w:p>
+            <w:r>
+              <w:t>Must Have</w:t>
+            </w:r>
+          </w:p>
+        </w:tc>
+      </w:tr>
+      <w:tr>
+        <w:tc>
+          <w:tcPr>
+            <w:tcW w:type="dxa" w:w="2400"/>
+          </w:tcPr>
+          <w:p>
+            <w:r>
+              <w:t>RF-15</w:t>
+            </w:r>
+          </w:p>
+        </w:tc>
+        <w:tc>
+          <w:tcPr>
+            <w:tcW w:type="dxa" w:w="2400"/>
+          </w:tcPr>
+          <w:p>
+            <w:r>
+              <w:t>Portal de Transparencia Societaria</w:t>
+            </w:r>
+          </w:p>
+        </w:tc>
+        <w:tc>
+          <w:tcPr>
+            <w:tcW w:type="dxa" w:w="2400"/>
+          </w:tcPr>
+          <w:p>
+            <w:r>
+              <w:t>Consulta pública y en tiempo real de fallos firmes y saldos individuales de la masa societaria.</w:t>
+            </w:r>
+          </w:p>
+        </w:tc>
+        <w:tc>
+          <w:tcPr>
+            <w:tcW w:type="dxa" w:w="2400"/>
+          </w:tcPr>
+          <w:p>
+            <w:r>
+              <w:t>Should Have</w:t>
+            </w:r>
+          </w:p>
+        </w:tc>
+      </w:tr>
+    </w:tbl>
+    <w:p>
+      <w:pPr>
+        <w:pStyle w:val="Ttulo2"/>
+      </w:pPr>
+      <w:r>
+        <w:t>MATRIZ DE TRAZABILIDAD NORMATIVA Y REGLAS DE NEGOCIO</w:t>
+      </w:r>
+    </w:p>
+    <w:p>
+      <w:r>
+        <w:t>El sistema vincula cada requerimiento funcional con el articulado del Estatuto Social 2026, Reglamento Interno y Reglamento Procesal 2026:</w:t>
+        <w:br/>
+        <w:t>• RF-01, RF-02 -&gt; Arts. 16 y 16 BIS, Arts. 21 a 26 Reg. Procesal (RN-01: Competencia de inicio de acciones).</w:t>
+        <w:br/>
+        <w:t>• RF-03, RF-04 -&gt; Art. 12 inc. 2 Reg. Procesal (RN-02: Plazo preclusivo de 5 días hábiles).</w:t>
+        <w:br/>
+        <w:t>• RF-05, RF-06 -&gt; Arts. 17 y 18 Reg. Procesal (RN-03 y RN-04: Justificaciones T02 y Descargos T03).</w:t>
+        <w:br/>
+        <w:t>• RF-07 a RF-10 -&gt; Arts. 12 y 13 Reg. Procesal, Art. 96 Estatuto (RN-05 y RN-06: 6 estados, quórum y mayoría absoluta).</w:t>
+        <w:br/>
+        <w:t>• RF-11 -&gt; Art. 12 inc. 5 Reg. Procesal (RN-07: Suscripción colegiada por Socios Seniors).</w:t>
+        <w:br/>
+        <w:t>• RF-12 -&gt; Circular 001/2026 TD (RN-08: Cómputo de saldos en múltiplos mínimos de 0.5 puntos).</w:t>
+        <w:br/>
+        <w:t>• RF-13 -&gt; Art. 93 Reglamento Interno de Disciplina (RN-09: Pérdida automática de condición de socio al alcanzar -10 puntos).</w:t>
+        <w:br/>
+        <w:t>• RF-14 -&gt; Art. 137 Reglamento Interno de Disciplina (RN-10: Obligatoriedad de Balances Cuatrimestrales de Auditoría Interna).</w:t>
+      </w:r>
+    </w:p>
+    <w:p>
+      <w:pPr>
+        <w:pStyle w:val="Ttulo2"/>
+      </w:pPr>
+      <w:r>
+        <w:t>REQUERIMIENTOS NO FUNCIONALES (ISO/IEC 25010) Y CLARIFICACIONES FORMALES</w:t>
+      </w:r>
+    </w:p>
+    <w:p>
+      <w:r>
+        <w:t>1. Usabilidad (RNF-01): Interfaz 100% Web y Responsive Mobile-First optimizada para smartphones y tablets (Puntuación SUS &gt;= 85).</w:t>
+        <w:br/>
+        <w:t>2. Requisito de Integridad y Trazabilidad Transaccional del Saldo (RNF-02 - Reformulación de 'no UPDATE directos'): El saldo de puntos de los socios no admitirá mutaciones directas ni ejecuciones manuales de sentencias SQL UPDATE en base de datos. Toda modificación se efectuará mediante transacciones de ajuste auditadas, registradas por triggers en MySQL en la tabla 'auditoria_puntos' con usuario responsable, fecha/hora, motivo y saldo anterior.</w:t>
+        <w:br/>
+        <w:t>3. Firma Electrónica Interna / Aprobación Colegiada Autenticada (RNF-03): Mecanismo de suscripción dentro de sesión autenticada con registro de timestamp e integridad por hash criptográfico SHA-256. Se deja constancia explícita de que no persigue validez legal bajo Ley Nacional 25.506 (Firma Digital con token de hardware o Autoridad Certificante licenciada), sino validez procesal e institucional interna conforme al Estatuto de AVEIT.</w:t>
+        <w:br/>
+        <w:t>4. Eficiencia de Desempeño (RNF-04): Tiempo de respuesta del servidor (latencia P95) inferior a 1.5 segundos en consultas generales.</w:t>
+      </w:r>
+    </w:p>
+    <w:p>
+      <w:pPr>
+        <w:pStyle w:val="Ttulo2"/>
+      </w:pPr>
+      <w:r>
+        <w:t>RESTRICCIONES TECNOLÓGICAS E INSTITUCIONALES (RES)</w:t>
+      </w:r>
+    </w:p>
+    <w:p>
+      <w:r>
+        <w:t>Separadas formalmente de los atributos de calidad, las restricciones del proyecto son:</w:t>
+        <w:br/>
+        <w:t>• RES-01 (Backend Institucional): Uso mandatorio de lenguaje Python para interoperabilidad con el ecosistema de AVEIT.</w:t>
+        <w:br/>
+        <w:t>• RES-02 (Base de Datos Relacional): Uso mandatorio de motor MySQL en compatibilidad con las tablas institucionales preexistentes.</w:t>
+        <w:br/>
+        <w:t>• RES-03 (Presupuesto Financiero $0): Proyecto donado ad honorem; no se admite contratación de licencias propietarias ni costos de infraestructura cloud pagos.</w:t>
+        <w:br/>
+        <w:t>• RES-04 (Ambiente Aislado de Staging): Desarrollo y testing exclusivo en infraestructura propia del equipo con datos de respaldo anonimizados provistos por Cómputos; prohibición de operar sobre el servidor de producción de AVEIT.</w:t>
+        <w:br/>
+        <w:t>• RES-05 (Despliegue Sujeto a Aprobación): La puesta en producción en la sede dependerá de la validación conjunta entre Cómputos y el Tribunal.</w:t>
+        <w:br/>
+        <w:t>• RES-06 (Formatos de Adjuntos): Archivos de comprobantes probatorios limitados a formato PDF/JPG/PNG con tamaño máximo de 5 MB.</w:t>
+      </w:r>
+    </w:p>
+    <w:p>
+      <w:pPr>
+        <w:pStyle w:val="Ttulo2"/>
+      </w:pPr>
+      <w:r>
+        <w:t>MARCO SCRUMBAN EN LA PRÁCTICA</w:t>
+      </w:r>
+    </w:p>
+    <w:p>
+      <w:r>
+        <w:t>El proyecto se ejecuta bajo Scrumban integrando:</w:t>
+        <w:br/>
+        <w:t>• Cadencias Scrum: Sprints quincenales alineados con los hitos académicos; Sprint Planning quincenal; Dailies asíncronas los lunes, miércoles y viernes en Discord; Sprint Review y Retrospectiva al cierre de cada incremento.</w:t>
+        <w:br/>
+        <w:t>• Flujo Kanban en Jira Software: Columnas 'Backlog', 'To Do' (WIP: 6), 'In Progress' (WIP: 4), 'Peer Code Review' (WIP: 3), 'Testing / Staging' (WIP: 3) y 'Done'.</w:t>
+        <w:br/>
+        <w:t>• Code Review Obligatoria: Todo código debe ser revisado por un par antes de fusionarse a la rama principal mediante Pull Request en GitHub.</w:t>
+        <w:br/>
+        <w:t>• Métricas de Flujo: Medición y optimización continua de Lead Time, Cycle Time (meta: &lt;= 3.5 días) y Diagrama de Flujo Acumulado (CFD).</w:t>
+      </w:r>
+    </w:p>
+    <w:p>
+      <w:pPr>
+        <w:pStyle w:val="Ttulo2"/>
+      </w:pPr>
+      <w:r>
+        <w:t>ESPECIFICACIÓN DE CASO DE USO NUCLEAR: CU-01 (useCaseExtractor)</w:t>
+      </w:r>
+    </w:p>
+    <w:p>
+      <w:r>
+        <w:t>CU-01: Presentar Descargo o Justificación Disciplinaria (Formularios T02/T03)</w:t>
+        <w:br/>
+        <w:t>• Actor Principal: Socio Ordinario (imputado).</w:t>
+        <w:br/>
+        <w:t>• Precondiciones: Socio autenticado con causa activa en estado 'En período de subida de justificaciones'; plazo de 5 días hábiles vigente (RN-02).</w:t>
+        <w:br/>
+        <w:t>• Garantía de Éxito: Justificación y comprobantes persistidos con sellado de tiempo; transición automática a 'Las justificaciones están siendo revisadas'; acuse de recibo enviado al socio.</w:t>
+        <w:br/>
+        <w:t>• Garantía Mínima: Rollback transaccional ante fallos de carga; no alteración del plazo preclusivo.</w:t>
+        <w:br/>
+        <w:t>• Happy Path: 1. El socio selecciona expediente notificado; 2. El sistema muestra detalle de imputación y temporizador de 5 días; 3. El socio selecciona T02 (tipificado) o T03 (descargo); 4. Completa motivos y adjunta comprobante PDF/JPG; 5. El sistema valida plazo y formato (RES-06), persiste la justificación y actualiza el estado a 'En Revisión'; 6. Emite acuse digital al socio.</w:t>
+      </w:r>
+    </w:p>
+    <w:p>
+      <w:r>
+        <w:br w:type="page"/>
+      </w:r>
+    </w:p>
+    <w:p>
+      <w:pPr>
+        <w:pStyle w:val="Ttulo2"/>
+      </w:pPr>
+      <w:r>
+        <w:t>CLASIFICACIÓN SISTÉMICA Y TAXONOMÍA DE SI (systemClassifier)</w:t>
+      </w:r>
+    </w:p>
+    <w:p>
+      <w:r>
+        <w:t>El sistema SGD-AVEIT se estructura bajo el paradigma de la Teoría General de Sistemas (TGS) como un sistema abierto inserto en el suprasistema A.V.E.I.T. Sus componentes funcionales se clasifican de acuerdo a la pirámide organizacional en:</w:t>
+        <w:br/>
+        <w:t>• TPS (Transaction Processing System): Módulo de Expedientes y Formularios (T01, T02, T03) y Motor de Ledger de Puntos, que procesan transacciones operativas en tiempo real con reglas fijas.</w:t>
+        <w:br/>
+        <w:t>• MIS (Management Information System): Módulo de Balances Cuatrimestrales y Estadísticas (Art. 137 del Reglamento Interno), que agrega datos transaccionales para supervisión táctica de subcomisiones.</w:t>
+        <w:br/>
+        <w:t>• DSS (Decision Support System): Tablero de Estados de Causas y Sistema de Alertas Escalonadas (-7 pts y -10 pts), que asiste al Tribunal de Disciplina y a CD mediante indicadores tempranos y precedentes jurisprudenciales.</w:t>
+        <w:br/>
+        <w:t>• EIS / Portal Ejecutivo: Portal de Transparencia Pública para consulta general del padrón y rendición de cuentas ante Asambleas.</w:t>
+      </w:r>
+    </w:p>
+    <w:p>
+      <w:pPr>
+        <w:pStyle w:val="Ttulo2"/>
+      </w:pPr>
+      <w:r>
+        <w:t>DESGLOSE GRANULAR DE REQUERIMIENTOS FUNCIONALES (requirementsExtractor)</w:t>
+      </w:r>
+    </w:p>
+    <w:p>
+      <w:r>
+        <w:t>A continuación se especifican los 15 Requerimientos Funcionales prioritarios (MoSCoW):</w:t>
+      </w:r>
+    </w:p>
+    <w:tbl>
+      <w:tblPr>
+        <w:tblW w:type="auto" w:w="0"/>
+        <w:jc w:val="center"/>
+        <w:tblLook w:firstColumn="1" w:firstRow="1" w:lastColumn="0" w:lastRow="0" w:noHBand="0" w:noVBand="1" w:val="04A0"/>
+      </w:tblPr>
+      <w:tblGrid>
+        <w:gridCol w:w="2400"/>
+        <w:gridCol w:w="2400"/>
+        <w:gridCol w:w="2400"/>
+        <w:gridCol w:w="2400"/>
+      </w:tblGrid>
+      <w:tr>
+        <w:tc>
+          <w:tcPr>
+            <w:tcW w:type="dxa" w:w="2400"/>
+          </w:tcPr>
+          <w:p>
+            <w:r>
+              <w:rPr>
+                <w:b/>
+              </w:rPr>
+              <w:t>ID</w:t>
+            </w:r>
+          </w:p>
+        </w:tc>
+        <w:tc>
+          <w:tcPr>
+            <w:tcW w:type="dxa" w:w="2400"/>
+          </w:tcPr>
+          <w:p>
+            <w:r>
+              <w:rPr>
+                <w:b/>
+              </w:rPr>
+              <w:t>Nombre Requerimiento</w:t>
+            </w:r>
+          </w:p>
+        </w:tc>
+        <w:tc>
+          <w:tcPr>
+            <w:tcW w:type="dxa" w:w="2400"/>
+          </w:tcPr>
+          <w:p>
+            <w:r>
+              <w:rPr>
+                <w:b/>
+              </w:rPr>
+              <w:t>Descripción Técnica / Funcional</w:t>
+            </w:r>
+          </w:p>
+        </w:tc>
+        <w:tc>
+          <w:tcPr>
+            <w:tcW w:type="dxa" w:w="2400"/>
+          </w:tcPr>
+          <w:p>
+            <w:r>
+              <w:rPr>
+                <w:b/>
+              </w:rPr>
+              <w:t>MoSCoW</w:t>
+            </w:r>
+          </w:p>
+        </w:tc>
+      </w:tr>
+      <w:tr>
+        <w:tc>
+          <w:tcPr>
+            <w:tcW w:type="dxa" w:w="2400"/>
+          </w:tcPr>
+          <w:p>
+            <w:r>
+              <w:t>RF-01</w:t>
+            </w:r>
+          </w:p>
+        </w:tc>
+        <w:tc>
+          <w:tcPr>
+            <w:tcW w:type="dxa" w:w="2400"/>
+          </w:tcPr>
+          <w:p>
+            <w:r>
+              <w:t>Gestión de Solicitudes T01</w:t>
+            </w:r>
+          </w:p>
+        </w:tc>
+        <w:tc>
+          <w:tcPr>
+            <w:tcW w:type="dxa" w:w="2400"/>
+          </w:tcPr>
+          <w:p>
+            <w:r>
+              <w:t>Alta formal de solicitudes de sanción/premio con Hoja de Anexo por autoridades habilitadas.</w:t>
+            </w:r>
+          </w:p>
+        </w:tc>
+        <w:tc>
+          <w:tcPr>
+            <w:tcW w:type="dxa" w:w="2400"/>
+          </w:tcPr>
+          <w:p>
+            <w:r>
+              <w:t>Must Have</w:t>
+            </w:r>
+          </w:p>
+        </w:tc>
+      </w:tr>
+      <w:tr>
+        <w:tc>
+          <w:tcPr>
+            <w:tcW w:type="dxa" w:w="2400"/>
+          </w:tcPr>
+          <w:p>
+            <w:r>
+              <w:t>RF-02</w:t>
+            </w:r>
+          </w:p>
+        </w:tc>
+        <w:tc>
+          <w:tcPr>
+            <w:tcW w:type="dxa" w:w="2400"/>
+          </w:tcPr>
+          <w:p>
+            <w:r>
+              <w:t>Apertura y Registro de Expediente</w:t>
+            </w:r>
+          </w:p>
+        </w:tc>
+        <w:tc>
+          <w:tcPr>
+            <w:tcW w:type="dxa" w:w="2400"/>
+          </w:tcPr>
+          <w:p>
+            <w:r>
+              <w:t>Generación unívoca de número de expediente y sellado de tiempo inicial.</w:t>
+            </w:r>
+          </w:p>
+        </w:tc>
+        <w:tc>
+          <w:tcPr>
+            <w:tcW w:type="dxa" w:w="2400"/>
+          </w:tcPr>
+          <w:p>
+            <w:r>
+              <w:t>Must Have</w:t>
+            </w:r>
+          </w:p>
+        </w:tc>
+      </w:tr>
+      <w:tr>
+        <w:tc>
+          <w:tcPr>
+            <w:tcW w:type="dxa" w:w="2400"/>
+          </w:tcPr>
+          <w:p>
+            <w:r>
+              <w:t>RF-03</w:t>
+            </w:r>
+          </w:p>
+        </w:tc>
+        <w:tc>
+          <w:tcPr>
+            <w:tcW w:type="dxa" w:w="2400"/>
+          </w:tcPr>
+          <w:p>
+            <w:r>
+              <w:t>Despacho de Acuses de Sanción</w:t>
+            </w:r>
+          </w:p>
+        </w:tc>
+        <w:tc>
+          <w:tcPr>
+            <w:tcW w:type="dxa" w:w="2400"/>
+          </w:tcPr>
+          <w:p>
+            <w:r>
+              <w:t>Notificación electrónica fehaciente al imputado iniciando el cómputo de términos.</w:t>
+            </w:r>
+          </w:p>
+        </w:tc>
+        <w:tc>
+          <w:tcPr>
+            <w:tcW w:type="dxa" w:w="2400"/>
+          </w:tcPr>
+          <w:p>
+            <w:r>
+              <w:t>Must Have</w:t>
+            </w:r>
+          </w:p>
+        </w:tc>
+      </w:tr>
+      <w:tr>
+        <w:tc>
+          <w:tcPr>
+            <w:tcW w:type="dxa" w:w="2400"/>
+          </w:tcPr>
+          <w:p>
+            <w:r>
+              <w:t>RF-04</w:t>
+            </w:r>
+          </w:p>
+        </w:tc>
+        <w:tc>
+          <w:tcPr>
+            <w:tcW w:type="dxa" w:w="2400"/>
+          </w:tcPr>
+          <w:p>
+            <w:r>
+              <w:t>Control de Plazo Preclusivo (5 días)</w:t>
+            </w:r>
+          </w:p>
+        </w:tc>
+        <w:tc>
+          <w:tcPr>
+            <w:tcW w:type="dxa" w:w="2400"/>
+          </w:tcPr>
+          <w:p>
+            <w:r>
+              <w:t>Temporizador automatizado de 5 días hábiles; bloqueo irreversible al vencimiento.</w:t>
+            </w:r>
+          </w:p>
+        </w:tc>
+        <w:tc>
+          <w:tcPr>
+            <w:tcW w:type="dxa" w:w="2400"/>
+          </w:tcPr>
+          <w:p>
+            <w:r>
+              <w:t>Must Have</w:t>
+            </w:r>
+          </w:p>
+        </w:tc>
+      </w:tr>
+      <w:tr>
+        <w:tc>
+          <w:tcPr>
+            <w:tcW w:type="dxa" w:w="2400"/>
+          </w:tcPr>
+          <w:p>
+            <w:r>
+              <w:t>RF-05</w:t>
+            </w:r>
+          </w:p>
+        </w:tc>
+        <w:tc>
+          <w:tcPr>
+            <w:tcW w:type="dxa" w:w="2400"/>
+          </w:tcPr>
+          <w:p>
+            <w:r>
+              <w:t>Carga Digital de Formulario T02</w:t>
+            </w:r>
+          </w:p>
+        </w:tc>
+        <w:tc>
+          <w:tcPr>
+            <w:tcW w:type="dxa" w:w="2400"/>
+          </w:tcPr>
+          <w:p>
+            <w:r>
+              <w:t>Interfaz responsive para presentar justificaciones tipificadas con adjuntos probatorios.</w:t>
+            </w:r>
+          </w:p>
+        </w:tc>
+        <w:tc>
+          <w:tcPr>
+            <w:tcW w:type="dxa" w:w="2400"/>
+          </w:tcPr>
+          <w:p>
+            <w:r>
+              <w:t>Must Have</w:t>
+            </w:r>
+          </w:p>
+        </w:tc>
+      </w:tr>
+      <w:tr>
+        <w:tc>
+          <w:tcPr>
+            <w:tcW w:type="dxa" w:w="2400"/>
+          </w:tcPr>
+          <w:p>
+            <w:r>
+              <w:t>RF-06</w:t>
+            </w:r>
+          </w:p>
+        </w:tc>
+        <w:tc>
+          <w:tcPr>
+            <w:tcW w:type="dxa" w:w="2400"/>
+          </w:tcPr>
+          <w:p>
+            <w:r>
+              <w:t>Carga Digital de Formulario T03</w:t>
+            </w:r>
+          </w:p>
+        </w:tc>
+        <w:tc>
+          <w:tcPr>
+            <w:tcW w:type="dxa" w:w="2400"/>
+          </w:tcPr>
+          <w:p>
+            <w:r>
+              <w:t>Interfaz responsive para descargos extraordinarios evaluados por sana crítica.</w:t>
+            </w:r>
+          </w:p>
+        </w:tc>
+        <w:tc>
+          <w:tcPr>
+            <w:tcW w:type="dxa" w:w="2400"/>
+          </w:tcPr>
+          <w:p>
+            <w:r>
+              <w:t>Must Have</w:t>
+            </w:r>
+          </w:p>
+        </w:tc>
+      </w:tr>
+      <w:tr>
+        <w:tc>
+          <w:tcPr>
+            <w:tcW w:type="dxa" w:w="2400"/>
+          </w:tcPr>
+          <w:p>
+            <w:r>
+              <w:t>RF-07</w:t>
+            </w:r>
+          </w:p>
+        </w:tc>
+        <w:tc>
+          <w:tcPr>
+            <w:tcW w:type="dxa" w:w="2400"/>
+          </w:tcPr>
+          <w:p>
+            <w:r>
+              <w:t>Tablero de Control de los 6 Estados</w:t>
+            </w:r>
+          </w:p>
+        </w:tc>
+        <w:tc>
+          <w:tcPr>
+            <w:tcW w:type="dxa" w:w="2400"/>
+          </w:tcPr>
+          <w:p>
+            <w:r>
+              <w:t>Visualización y transición estricta de expedientes a lo largo de sus 6 estados oficiales.</w:t>
+            </w:r>
+          </w:p>
+        </w:tc>
+        <w:tc>
+          <w:tcPr>
+            <w:tcW w:type="dxa" w:w="2400"/>
+          </w:tcPr>
+          <w:p>
+            <w:r>
+              <w:t>Must Have</w:t>
+            </w:r>
+          </w:p>
+        </w:tc>
+      </w:tr>
+      <w:tr>
+        <w:tc>
+          <w:tcPr>
+            <w:tcW w:type="dxa" w:w="2400"/>
+          </w:tcPr>
+          <w:p>
+            <w:r>
+              <w:t>RF-08</w:t>
+            </w:r>
+          </w:p>
+        </w:tc>
+        <w:tc>
+          <w:tcPr>
+            <w:tcW w:type="dxa" w:w="2400"/>
+          </w:tcPr>
+          <w:p>
+            <w:r>
+              <w:t>Evaluación y Sustanciación de Descargos</w:t>
+            </w:r>
+          </w:p>
+        </w:tc>
+        <w:tc>
+          <w:tcPr>
+            <w:tcW w:type="dxa" w:w="2400"/>
+          </w:tcPr>
+          <w:p>
+            <w:r>
+              <w:t>Herramientas de revisión probatoria, aprobación o rechazo fundado de justificaciones.</w:t>
+            </w:r>
+          </w:p>
+        </w:tc>
+        <w:tc>
+          <w:tcPr>
+            <w:tcW w:type="dxa" w:w="2400"/>
+          </w:tcPr>
+          <w:p>
+            <w:r>
+              <w:t>Must Have</w:t>
+            </w:r>
+          </w:p>
+        </w:tc>
+      </w:tr>
+      <w:tr>
+        <w:tc>
+          <w:tcPr>
+            <w:tcW w:type="dxa" w:w="2400"/>
+          </w:tcPr>
+          <w:p>
+            <w:r>
+              <w:t>RF-09</w:t>
+            </w:r>
+          </w:p>
+        </w:tc>
+        <w:tc>
+          <w:tcPr>
+            <w:tcW w:type="dxa" w:w="2400"/>
+          </w:tcPr>
+          <w:p>
+            <w:r>
+              <w:t>Registro Nominal de Votación del TD</w:t>
+            </w:r>
+          </w:p>
+        </w:tc>
+        <w:tc>
+          <w:tcPr>
+            <w:tcW w:type="dxa" w:w="2400"/>
+          </w:tcPr>
+          <w:p>
+            <w:r>
+              <w:t>Cómputo formal de mayoría absoluta en votación nominal individual de miembros habilitados.</w:t>
+            </w:r>
+          </w:p>
+        </w:tc>
+        <w:tc>
+          <w:tcPr>
+            <w:tcW w:type="dxa" w:w="2400"/>
+          </w:tcPr>
+          <w:p>
+            <w:r>
+              <w:t>Must Have</w:t>
+            </w:r>
+          </w:p>
+        </w:tc>
+      </w:tr>
+      <w:tr>
+        <w:tc>
+          <w:tcPr>
+            <w:tcW w:type="dxa" w:w="2400"/>
+          </w:tcPr>
+          <w:p>
+            <w:r>
+              <w:t>RF-10</w:t>
+            </w:r>
+          </w:p>
+        </w:tc>
+        <w:tc>
+          <w:tcPr>
+            <w:tcW w:type="dxa" w:w="2400"/>
+          </w:tcPr>
+          <w:p>
+            <w:r>
+              <w:t>Redacción Guiada de Resoluciones</w:t>
+            </w:r>
+          </w:p>
+        </w:tc>
+        <w:tc>
+          <w:tcPr>
+            <w:tcW w:type="dxa" w:w="2400"/>
+          </w:tcPr>
+          <w:p>
+            <w:r>
+              <w:t>Plantilla jurídica obligatoria (Vistos, Considerandos y Resolución) con graduación de puntos.</w:t>
+            </w:r>
+          </w:p>
+        </w:tc>
+        <w:tc>
+          <w:tcPr>
+            <w:tcW w:type="dxa" w:w="2400"/>
+          </w:tcPr>
+          <w:p>
+            <w:r>
+              <w:t>Must Have</w:t>
+            </w:r>
+          </w:p>
+        </w:tc>
+      </w:tr>
+      <w:tr>
+        <w:tc>
+          <w:tcPr>
+            <w:tcW w:type="dxa" w:w="2400"/>
+          </w:tcPr>
+          <w:p>
+            <w:r>
+              <w:t>RF-11</w:t>
+            </w:r>
+          </w:p>
+        </w:tc>
+        <w:tc>
+          <w:tcPr>
+            <w:tcW w:type="dxa" w:w="2400"/>
+          </w:tcPr>
+          <w:p>
+            <w:r>
+              <w:t>Aprobación Colegiada Autenticada</w:t>
+            </w:r>
+          </w:p>
+        </w:tc>
+        <w:tc>
+          <w:tcPr>
+            <w:tcW w:type="dxa" w:w="2400"/>
+          </w:tcPr>
+          <w:p>
+            <w:r>
+              <w:t>Firma electrónica interna de Socios Seniors con ID, timestamp y hash SHA-256.</w:t>
+            </w:r>
+          </w:p>
+        </w:tc>
+        <w:tc>
+          <w:tcPr>
+            <w:tcW w:type="dxa" w:w="2400"/>
+          </w:tcPr>
+          <w:p>
+            <w:r>
+              <w:t>Must Have</w:t>
+            </w:r>
+          </w:p>
+        </w:tc>
+      </w:tr>
+      <w:tr>
+        <w:tc>
+          <w:tcPr>
+            <w:tcW w:type="dxa" w:w="2400"/>
+          </w:tcPr>
+          <w:p>
+            <w:r>
+              <w:t>RF-12</w:t>
+            </w:r>
+          </w:p>
+        </w:tc>
+        <w:tc>
+          <w:tcPr>
+            <w:tcW w:type="dxa" w:w="2400"/>
+          </w:tcPr>
+          <w:p>
+            <w:r>
+              <w:t>Cómputo Inmutable de Saldos de Puntos</w:t>
+            </w:r>
+          </w:p>
+        </w:tc>
+        <w:tc>
+          <w:tcPr>
+            <w:tcW w:type="dxa" w:w="2400"/>
+          </w:tcPr>
+          <w:p>
+            <w:r>
+              <w:t>Impacto transaccional de puntos en múltiplos de 0.5 mediante triggers y lógica de backend.</w:t>
+            </w:r>
+          </w:p>
+        </w:tc>
+        <w:tc>
+          <w:tcPr>
+            <w:tcW w:type="dxa" w:w="2400"/>
+          </w:tcPr>
+          <w:p>
+            <w:r>
+              <w:t>Must Have</w:t>
+            </w:r>
+          </w:p>
+        </w:tc>
+      </w:tr>
+      <w:tr>
+        <w:tc>
+          <w:tcPr>
+            <w:tcW w:type="dxa" w:w="2400"/>
+          </w:tcPr>
+          <w:p>
+            <w:r>
+              <w:t>RF-13</w:t>
+            </w:r>
+          </w:p>
+        </w:tc>
+        <w:tc>
+          <w:tcPr>
+            <w:tcW w:type="dxa" w:w="2400"/>
+          </w:tcPr>
+          <w:p>
+            <w:r>
+              <w:t>Disparo de Alertas Escalonadas</w:t>
+            </w:r>
+          </w:p>
+        </w:tc>
+        <w:tc>
+          <w:tcPr>
+            <w:tcW w:type="dxa" w:w="2400"/>
+          </w:tcPr>
+          <w:p>
+            <w:r>
+              <w:t>Alerta amarilla a -7 pts y alerta roja de pérdida de condición de socio a -10 pts (Art. 93).</w:t>
+            </w:r>
+          </w:p>
+        </w:tc>
+        <w:tc>
+          <w:tcPr>
+            <w:tcW w:type="dxa" w:w="2400"/>
+          </w:tcPr>
+          <w:p>
+            <w:r>
+              <w:t>Must Have</w:t>
+            </w:r>
+          </w:p>
+        </w:tc>
+      </w:tr>
+      <w:tr>
+        <w:tc>
+          <w:tcPr>
+            <w:tcW w:type="dxa" w:w="2400"/>
+          </w:tcPr>
+          <w:p>
+            <w:r>
+              <w:t>RF-14</w:t>
+            </w:r>
+          </w:p>
+        </w:tc>
+        <w:tc>
+          <w:tcPr>
+            <w:tcW w:type="dxa" w:w="2400"/>
+          </w:tcPr>
+          <w:p>
+            <w:r>
+              <w:t>Generación de Balances Cuatrimestrales</w:t>
+            </w:r>
+          </w:p>
+        </w:tc>
+        <w:tc>
+          <w:tcPr>
+            <w:tcW w:type="dxa" w:w="2400"/>
+          </w:tcPr>
+          <w:p>
+            <w:r>
+              <w:t>Emisión instantánea en PDF del balance de auditoría por subcomisiones y categoría (Art. 137).</w:t>
+            </w:r>
+          </w:p>
+        </w:tc>
+        <w:tc>
+          <w:tcPr>
+            <w:tcW w:type="dxa" w:w="2400"/>
+          </w:tcPr>
+          <w:p>
+            <w:r>
+              <w:t>Must Have</w:t>
+            </w:r>
+          </w:p>
+        </w:tc>
+      </w:tr>
+      <w:tr>
+        <w:tc>
+          <w:tcPr>
+            <w:tcW w:type="dxa" w:w="2400"/>
+          </w:tcPr>
+          <w:p>
+            <w:r>
+              <w:t>RF-15</w:t>
+            </w:r>
+          </w:p>
+        </w:tc>
+        <w:tc>
+          <w:tcPr>
+            <w:tcW w:type="dxa" w:w="2400"/>
+          </w:tcPr>
+          <w:p>
+            <w:r>
+              <w:t>Portal de Transparencia Societaria</w:t>
+            </w:r>
+          </w:p>
+        </w:tc>
+        <w:tc>
+          <w:tcPr>
+            <w:tcW w:type="dxa" w:w="2400"/>
+          </w:tcPr>
+          <w:p>
+            <w:r>
+              <w:t>Consulta pública y en tiempo real de fallos firmes y saldos individuales de la masa societaria.</w:t>
+            </w:r>
+          </w:p>
+        </w:tc>
+        <w:tc>
+          <w:tcPr>
+            <w:tcW w:type="dxa" w:w="2400"/>
+          </w:tcPr>
+          <w:p>
+            <w:r>
+              <w:t>Should Have</w:t>
+            </w:r>
+          </w:p>
+        </w:tc>
+      </w:tr>
+    </w:tbl>
+    <w:p>
+      <w:pPr>
+        <w:pStyle w:val="Ttulo2"/>
+      </w:pPr>
+      <w:r>
+        <w:t>MATRIZ DE TRAZABILIDAD NORMATIVA Y REGLAS DE NEGOCIO</w:t>
+      </w:r>
+    </w:p>
+    <w:p>
+      <w:r>
+        <w:t>El sistema vincula cada requerimiento funcional con el articulado del Estatuto Social 2026, Reglamento Interno y Reglamento Procesal 2026:</w:t>
+        <w:br/>
+        <w:t>• RF-01, RF-02 -&gt; Arts. 16 y 16 BIS, Arts. 21 a 26 Reg. Procesal (RN-01: Competencia de inicio de acciones).</w:t>
+        <w:br/>
+        <w:t>• RF-03, RF-04 -&gt; Art. 12 inc. 2 Reg. Procesal (RN-02: Plazo preclusivo de 5 días hábiles).</w:t>
+        <w:br/>
+        <w:t>• RF-05, RF-06 -&gt; Arts. 17 y 18 Reg. Procesal (RN-03 y RN-04: Justificaciones T02 y Descargos T03).</w:t>
+        <w:br/>
+        <w:t>• RF-07 a RF-10 -&gt; Arts. 12 y 13 Reg. Procesal, Art. 96 Estatuto (RN-05 y RN-06: 6 estados, quórum y mayoría absoluta).</w:t>
+        <w:br/>
+        <w:t>• RF-11 -&gt; Art. 12 inc. 5 Reg. Procesal (RN-07: Suscripción colegiada por Socios Seniors).</w:t>
+        <w:br/>
+        <w:t>• RF-12 -&gt; Circular 001/2026 TD (RN-08: Cómputo de saldos en múltiplos mínimos de 0.5 puntos).</w:t>
+        <w:br/>
+        <w:t>• RF-13 -&gt; Art. 93 Reglamento Interno de Disciplina (RN-09: Pérdida automática de condición de socio al alcanzar -10 puntos).</w:t>
+        <w:br/>
+        <w:t>• RF-14 -&gt; Art. 137 Reglamento Interno de Disciplina (RN-10: Obligatoriedad de Balances Cuatrimestrales de Auditoría Interna).</w:t>
+      </w:r>
+    </w:p>
+    <w:p>
+      <w:pPr>
+        <w:pStyle w:val="Ttulo2"/>
+      </w:pPr>
+      <w:r>
+        <w:t>REQUERIMIENTOS NO FUNCIONALES (ISO/IEC 25010) Y CLARIFICACIONES FORMALES</w:t>
+      </w:r>
+    </w:p>
+    <w:p>
+      <w:r>
+        <w:t>1. Usabilidad (RNF-01): Interfaz 100% Web y Responsive Mobile-First optimizada para smartphones y tablets (Puntuación SUS &gt;= 85).</w:t>
+        <w:br/>
+        <w:t>2. Requisito de Integridad y Trazabilidad Transaccional del Saldo (RNF-02 - Reformulación de 'no UPDATE directos'): El saldo de puntos de los socios no admitirá mutaciones directas ni ejecuciones manuales de sentencias SQL UPDATE en base de datos. Toda modificación se efectuará mediante transacciones de ajuste auditadas, registradas por triggers en MySQL en la tabla 'auditoria_puntos' con usuario responsable, fecha/hora, motivo y saldo anterior.</w:t>
+        <w:br/>
+        <w:t>3. Firma Electrónica Interna / Aprobación Colegiada Autenticada (RNF-03): Mecanismo de suscripción dentro de sesión autenticada con registro de timestamp e integridad por hash criptográfico SHA-256. Se deja constancia explícita de que no persigue validez legal bajo Ley Nacional 25.506 (Firma Digital con token de hardware o Autoridad Certificante licenciada), sino validez procesal e institucional interna conforme al Estatuto de AVEIT.</w:t>
+        <w:br/>
+        <w:t>4. Eficiencia de Desempeño (RNF-04): Tiempo de respuesta del servidor (latencia P95) inferior a 1.5 segundos en consultas generales.</w:t>
+      </w:r>
+    </w:p>
+    <w:p>
+      <w:pPr>
+        <w:pStyle w:val="Ttulo2"/>
+      </w:pPr>
+      <w:r>
+        <w:t>RESTRICCIONES TECNOLÓGICAS E INSTITUCIONALES (RES)</w:t>
+      </w:r>
+    </w:p>
+    <w:p>
+      <w:r>
+        <w:t>Separadas formalmente de los atributos de calidad, las restricciones del proyecto son:</w:t>
+        <w:br/>
+        <w:t>• RES-01 (Backend Institucional): Uso mandatorio de lenguaje Python para interoperabilidad con el ecosistema de AVEIT.</w:t>
+        <w:br/>
+        <w:t>• RES-02 (Base de Datos Relacional): Uso mandatorio de motor MySQL en compatibilidad con las tablas institucionales preexistentes.</w:t>
+        <w:br/>
+        <w:t>• RES-03 (Presupuesto Financiero $0): Proyecto donado ad honorem; no se admite contratación de licencias propietarias ni costos de infraestructura cloud pagos.</w:t>
+        <w:br/>
+        <w:t>• RES-04 (Ambiente Aislado de Staging): Desarrollo y testing exclusivo en infraestructura propia del equipo con datos de respaldo anonimizados provistos por Cómputos; prohibición de operar sobre el servidor de producción de AVEIT.</w:t>
+        <w:br/>
+        <w:t>• RES-05 (Despliegue Sujeto a Aprobación): La puesta en producción en la sede dependerá de la validación conjunta entre Cómputos y el Tribunal.</w:t>
+        <w:br/>
+        <w:t>• RES-06 (Formatos de Adjuntos): Archivos de comprobantes probatorios limitados a formato PDF/JPG/PNG con tamaño máximo de 5 MB.</w:t>
+      </w:r>
+    </w:p>
+    <w:p>
+      <w:pPr>
+        <w:pStyle w:val="Ttulo2"/>
+      </w:pPr>
+      <w:r>
+        <w:t>MARCO SCRUMBAN EN LA PRÁCTICA</w:t>
+      </w:r>
+    </w:p>
+    <w:p>
+      <w:r>
+        <w:t>El proyecto se ejecuta bajo Scrumban integrando:</w:t>
+        <w:br/>
+        <w:t>• Cadencias Scrum: Sprints quincenales alineados con los hitos académicos; Sprint Planning quincenal; Dailies asíncronas los lunes, miércoles y viernes en Discord; Sprint Review y Retrospectiva al cierre de cada incremento.</w:t>
+        <w:br/>
+        <w:t>• Flujo Kanban en Jira Software: Columnas 'Backlog', 'To Do' (WIP: 6), 'In Progress' (WIP: 4), 'Peer Code Review' (WIP: 3), 'Testing / Staging' (WIP: 3) y 'Done'.</w:t>
+        <w:br/>
+        <w:t>• Code Review Obligatoria: Todo código debe ser revisado por un par antes de fusionarse a la rama principal mediante Pull Request en GitHub.</w:t>
+        <w:br/>
+        <w:t>• Métricas de Flujo: Medición y optimización continua de Lead Time, Cycle Time (meta: &lt;= 3.5 días) y Diagrama de Flujo Acumulado (CFD).</w:t>
+      </w:r>
+    </w:p>
+    <w:p>
+      <w:pPr>
+        <w:pStyle w:val="Ttulo2"/>
+      </w:pPr>
+      <w:r>
+        <w:t>ESPECIFICACIÓN DE CASO DE USO NUCLEAR: CU-01 (useCaseExtractor)</w:t>
+      </w:r>
+    </w:p>
+    <w:p>
+      <w:r>
+        <w:t>CU-01: Presentar Descargo o Justificación Disciplinaria (Formularios T02/T03)</w:t>
+        <w:br/>
+        <w:t>• Actor Principal: Socio Ordinario (imputado).</w:t>
+        <w:br/>
+        <w:t>• Precondiciones: Socio autenticado con causa activa en estado 'En período de subida de justificaciones'; plazo de 5 días hábiles vigente (RN-02).</w:t>
+        <w:br/>
+        <w:t>• Garantía de Éxito: Justificación y comprobantes persistidos con sellado de tiempo; transición automática a 'Las justificaciones están siendo revisadas'; acuse de recibo enviado al socio.</w:t>
+        <w:br/>
+        <w:t>• Garantía Mínima: Rollback transaccional ante fallos de carga; no alteración del plazo preclusivo.</w:t>
+        <w:br/>
+        <w:t>• Happy Path: 1. El socio selecciona expediente notificado; 2. El sistema muestra detalle de imputación y temporizador de 5 días; 3. El socio selecciona T02 (tipificado) o T03 (descargo); 4. Completa motivos y adjunta comprobante PDF/JPG; 5. El sistema valida plazo y formato (RES-06), persiste la justificación y actualiza el estado a 'En Revisión'; 6. Emite acuse digital al socio.</w:t>
       </w:r>
     </w:p>
     <w:sectPr>

</xml_diff>